<commit_message>
docs: Update THACO process document.
</commit_message>
<xml_diff>
--- a/THACO process.docx
+++ b/THACO process.docx
@@ -1,6 +1,6 @@
 
 <file path=word/document.xml><?xml version="1.0" encoding="utf-8"?>
-<w:document xmlns:wpc="http://schemas.microsoft.com/office/word/2010/wordprocessingCanvas" xmlns:cx="http://schemas.microsoft.com/office/drawing/2014/chartex" xmlns:cx1="http://schemas.microsoft.com/office/drawing/2015/9/8/chartex" xmlns:cx2="http://schemas.microsoft.com/office/drawing/2015/10/21/chartex" xmlns:cx3="http://schemas.microsoft.com/office/drawing/2016/5/9/chartex" xmlns:cx4="http://schemas.microsoft.com/office/drawing/2016/5/10/chartex" xmlns:cx5="http://schemas.microsoft.com/office/drawing/2016/5/11/chartex" xmlns:cx6="http://schemas.microsoft.com/office/drawing/2016/5/12/chartex" xmlns:cx7="http://schemas.microsoft.com/office/drawing/2016/5/13/chartex" xmlns:cx8="http://schemas.microsoft.com/office/drawing/2016/5/14/chartex" xmlns:mc="http://schemas.openxmlformats.org/markup-compatibility/2006" xmlns:aink="http://schemas.microsoft.com/office/drawing/2016/ink" xmlns:am3d="http://schemas.microsoft.com/office/drawing/2017/model3d" xmlns:o="urn:schemas-microsoft-com:office:office" xmlns:r="http://schemas.openxmlformats.org/officeDocument/2006/relationships" xmlns:m="http://schemas.openxmlformats.org/officeDocument/2006/math" xmlns:v="urn:schemas-microsoft-com:vml" xmlns:wp14="http://schemas.microsoft.com/office/word/2010/wordprocessingDrawing" xmlns:wp="http://schemas.openxmlformats.org/drawingml/2006/wordprocessingDrawing" xmlns:w10="urn:schemas-microsoft-com:office:word" xmlns:w="http://schemas.openxmlformats.org/wordprocessingml/2006/main" xmlns:w14="http://schemas.microsoft.com/office/word/2010/wordml" xmlns:w15="http://schemas.microsoft.com/office/word/2012/wordml" xmlns:w16cex="http://schemas.microsoft.com/office/word/2018/wordml/cex" xmlns:w16cid="http://schemas.microsoft.com/office/word/2016/wordml/cid" xmlns:w16="http://schemas.microsoft.com/office/word/2018/wordml" xmlns:w16sdtdh="http://schemas.microsoft.com/office/word/2020/wordml/sdtdatahash" xmlns:w16se="http://schemas.microsoft.com/office/word/2015/wordml/symex" xmlns:wpg="http://schemas.microsoft.com/office/word/2010/wordprocessingGroup" xmlns:wpi="http://schemas.microsoft.com/office/word/2010/wordprocessingInk" xmlns:wne="http://schemas.microsoft.com/office/word/2006/wordml" xmlns:wps="http://schemas.microsoft.com/office/word/2010/wordprocessingShape" mc:Ignorable="w14 w15 w16se w16cid w16 w16cex w16sdtdh wp14">
+<w:document xmlns:wpc="http://schemas.microsoft.com/office/word/2010/wordprocessingCanvas" xmlns:cx="http://schemas.microsoft.com/office/drawing/2014/chartex" xmlns:cx1="http://schemas.microsoft.com/office/drawing/2015/9/8/chartex" xmlns:cx2="http://schemas.microsoft.com/office/drawing/2015/10/21/chartex" xmlns:cx3="http://schemas.microsoft.com/office/drawing/2016/5/9/chartex" xmlns:cx4="http://schemas.microsoft.com/office/drawing/2016/5/10/chartex" xmlns:cx5="http://schemas.microsoft.com/office/drawing/2016/5/11/chartex" xmlns:cx6="http://schemas.microsoft.com/office/drawing/2016/5/12/chartex" xmlns:cx7="http://schemas.microsoft.com/office/drawing/2016/5/13/chartex" xmlns:cx8="http://schemas.microsoft.com/office/drawing/2016/5/14/chartex" xmlns:mc="http://schemas.openxmlformats.org/markup-compatibility/2006" xmlns:aink="http://schemas.microsoft.com/office/drawing/2016/ink" xmlns:am3d="http://schemas.microsoft.com/office/drawing/2017/model3d" xmlns:o="urn:schemas-microsoft-com:office:office" xmlns:oel="http://schemas.microsoft.com/office/2019/extlst" xmlns:r="http://schemas.openxmlformats.org/officeDocument/2006/relationships" xmlns:m="http://schemas.openxmlformats.org/officeDocument/2006/math" xmlns:v="urn:schemas-microsoft-com:vml" xmlns:wp14="http://schemas.microsoft.com/office/word/2010/wordprocessingDrawing" xmlns:wp="http://schemas.openxmlformats.org/drawingml/2006/wordprocessingDrawing" xmlns:w10="urn:schemas-microsoft-com:office:word" xmlns:w="http://schemas.openxmlformats.org/wordprocessingml/2006/main" xmlns:w14="http://schemas.microsoft.com/office/word/2010/wordml" xmlns:w15="http://schemas.microsoft.com/office/word/2012/wordml" xmlns:w16cex="http://schemas.microsoft.com/office/word/2018/wordml/cex" xmlns:w16cid="http://schemas.microsoft.com/office/word/2016/wordml/cid" xmlns:w16="http://schemas.microsoft.com/office/word/2018/wordml" xmlns:w16sdtdh="http://schemas.microsoft.com/office/word/2020/wordml/sdtdatahash" xmlns:w16se="http://schemas.microsoft.com/office/word/2015/wordml/symex" xmlns:wpg="http://schemas.microsoft.com/office/word/2010/wordprocessingGroup" xmlns:wpi="http://schemas.microsoft.com/office/word/2010/wordprocessingInk" xmlns:wne="http://schemas.microsoft.com/office/word/2006/wordml" xmlns:wps="http://schemas.microsoft.com/office/word/2010/wordprocessingShape" mc:Ignorable="w14 w15 w16se w16cid w16 w16cex w16sdtdh wp14">
   <w:body>
     <w:p>
       <w:pPr>
@@ -1324,6 +1324,7 @@
     <w:p>
       <w:pPr>
         <w:spacing w:before="100" w:beforeAutospacing="1" w:after="100" w:afterAutospacing="1"/>
+        <w:ind w:left="720"/>
         <w:outlineLvl w:val="1"/>
         <w:rPr>
           <w:rFonts w:ascii="Times New Roman" w:eastAsia="Times New Roman" w:hAnsi="Times New Roman" w:cs="Times New Roman"/>
@@ -1347,6 +1348,7 @@
     <w:p>
       <w:pPr>
         <w:spacing w:before="100" w:beforeAutospacing="1" w:after="100" w:afterAutospacing="1"/>
+        <w:ind w:left="720"/>
         <w:rPr>
           <w:rFonts w:ascii="Times New Roman" w:eastAsia="Times New Roman" w:hAnsi="Times New Roman" w:cs="Times New Roman"/>
         </w:rPr>
@@ -1398,7 +1400,12 @@
           <w:ilvl w:val="0"/>
           <w:numId w:val="9"/>
         </w:numPr>
-        <w:spacing w:before="100" w:beforeAutospacing="1" w:after="100" w:afterAutospacing="1"/>
+        <w:tabs>
+          <w:tab w:val="clear" w:pos="720"/>
+          <w:tab w:val="num" w:pos="1440"/>
+        </w:tabs>
+        <w:spacing w:before="100" w:beforeAutospacing="1" w:after="100" w:afterAutospacing="1"/>
+        <w:ind w:left="1440"/>
         <w:rPr>
           <w:rFonts w:ascii="Times New Roman" w:eastAsia="Times New Roman" w:hAnsi="Times New Roman" w:cs="Times New Roman"/>
         </w:rPr>
@@ -1416,7 +1423,12 @@
           <w:ilvl w:val="0"/>
           <w:numId w:val="9"/>
         </w:numPr>
-        <w:spacing w:before="100" w:beforeAutospacing="1" w:after="100" w:afterAutospacing="1"/>
+        <w:tabs>
+          <w:tab w:val="clear" w:pos="720"/>
+          <w:tab w:val="num" w:pos="1440"/>
+        </w:tabs>
+        <w:spacing w:before="100" w:beforeAutospacing="1" w:after="100" w:afterAutospacing="1"/>
+        <w:ind w:left="1440"/>
         <w:rPr>
           <w:rFonts w:ascii="Times New Roman" w:eastAsia="Times New Roman" w:hAnsi="Times New Roman" w:cs="Times New Roman"/>
         </w:rPr>
@@ -1434,7 +1446,12 @@
           <w:ilvl w:val="0"/>
           <w:numId w:val="9"/>
         </w:numPr>
-        <w:spacing w:before="100" w:beforeAutospacing="1" w:after="100" w:afterAutospacing="1"/>
+        <w:tabs>
+          <w:tab w:val="clear" w:pos="720"/>
+          <w:tab w:val="num" w:pos="1440"/>
+        </w:tabs>
+        <w:spacing w:before="100" w:beforeAutospacing="1" w:after="100" w:afterAutospacing="1"/>
+        <w:ind w:left="1440"/>
         <w:rPr>
           <w:rFonts w:ascii="Times New Roman" w:eastAsia="Times New Roman" w:hAnsi="Times New Roman" w:cs="Times New Roman"/>
         </w:rPr>
@@ -3136,7 +3153,7 @@
 </file>
 
 <file path=word/numbering.xml><?xml version="1.0" encoding="utf-8"?>
-<w:numbering xmlns:wpc="http://schemas.microsoft.com/office/word/2010/wordprocessingCanvas" xmlns:cx="http://schemas.microsoft.com/office/drawing/2014/chartex" xmlns:cx1="http://schemas.microsoft.com/office/drawing/2015/9/8/chartex" xmlns:cx2="http://schemas.microsoft.com/office/drawing/2015/10/21/chartex" xmlns:cx3="http://schemas.microsoft.com/office/drawing/2016/5/9/chartex" xmlns:cx4="http://schemas.microsoft.com/office/drawing/2016/5/10/chartex" xmlns:cx5="http://schemas.microsoft.com/office/drawing/2016/5/11/chartex" xmlns:cx6="http://schemas.microsoft.com/office/drawing/2016/5/12/chartex" xmlns:cx7="http://schemas.microsoft.com/office/drawing/2016/5/13/chartex" xmlns:cx8="http://schemas.microsoft.com/office/drawing/2016/5/14/chartex" xmlns:mc="http://schemas.openxmlformats.org/markup-compatibility/2006" xmlns:aink="http://schemas.microsoft.com/office/drawing/2016/ink" xmlns:am3d="http://schemas.microsoft.com/office/drawing/2017/model3d" xmlns:o="urn:schemas-microsoft-com:office:office" xmlns:r="http://schemas.openxmlformats.org/officeDocument/2006/relationships" xmlns:m="http://schemas.openxmlformats.org/officeDocument/2006/math" xmlns:v="urn:schemas-microsoft-com:vml" xmlns:wp14="http://schemas.microsoft.com/office/word/2010/wordprocessingDrawing" xmlns:wp="http://schemas.openxmlformats.org/drawingml/2006/wordprocessingDrawing" xmlns:w10="urn:schemas-microsoft-com:office:word" xmlns:w="http://schemas.openxmlformats.org/wordprocessingml/2006/main" xmlns:w14="http://schemas.microsoft.com/office/word/2010/wordml" xmlns:w15="http://schemas.microsoft.com/office/word/2012/wordml" xmlns:w16cex="http://schemas.microsoft.com/office/word/2018/wordml/cex" xmlns:w16cid="http://schemas.microsoft.com/office/word/2016/wordml/cid" xmlns:w16="http://schemas.microsoft.com/office/word/2018/wordml" xmlns:w16sdtdh="http://schemas.microsoft.com/office/word/2020/wordml/sdtdatahash" xmlns:w16se="http://schemas.microsoft.com/office/word/2015/wordml/symex" xmlns:wpg="http://schemas.microsoft.com/office/word/2010/wordprocessingGroup" xmlns:wpi="http://schemas.microsoft.com/office/word/2010/wordprocessingInk" xmlns:wne="http://schemas.microsoft.com/office/word/2006/wordml" xmlns:wps="http://schemas.microsoft.com/office/word/2010/wordprocessingShape" mc:Ignorable="w14 w15 w16se w16cid w16 w16cex w16sdtdh wp14">
+<w:numbering xmlns:wpc="http://schemas.microsoft.com/office/word/2010/wordprocessingCanvas" xmlns:cx="http://schemas.microsoft.com/office/drawing/2014/chartex" xmlns:cx1="http://schemas.microsoft.com/office/drawing/2015/9/8/chartex" xmlns:cx2="http://schemas.microsoft.com/office/drawing/2015/10/21/chartex" xmlns:cx3="http://schemas.microsoft.com/office/drawing/2016/5/9/chartex" xmlns:cx4="http://schemas.microsoft.com/office/drawing/2016/5/10/chartex" xmlns:cx5="http://schemas.microsoft.com/office/drawing/2016/5/11/chartex" xmlns:cx6="http://schemas.microsoft.com/office/drawing/2016/5/12/chartex" xmlns:cx7="http://schemas.microsoft.com/office/drawing/2016/5/13/chartex" xmlns:cx8="http://schemas.microsoft.com/office/drawing/2016/5/14/chartex" xmlns:mc="http://schemas.openxmlformats.org/markup-compatibility/2006" xmlns:aink="http://schemas.microsoft.com/office/drawing/2016/ink" xmlns:am3d="http://schemas.microsoft.com/office/drawing/2017/model3d" xmlns:o="urn:schemas-microsoft-com:office:office" xmlns:oel="http://schemas.microsoft.com/office/2019/extlst" xmlns:r="http://schemas.openxmlformats.org/officeDocument/2006/relationships" xmlns:m="http://schemas.openxmlformats.org/officeDocument/2006/math" xmlns:v="urn:schemas-microsoft-com:vml" xmlns:wp14="http://schemas.microsoft.com/office/word/2010/wordprocessingDrawing" xmlns:wp="http://schemas.openxmlformats.org/drawingml/2006/wordprocessingDrawing" xmlns:w10="urn:schemas-microsoft-com:office:word" xmlns:w="http://schemas.openxmlformats.org/wordprocessingml/2006/main" xmlns:w14="http://schemas.microsoft.com/office/word/2010/wordml" xmlns:w15="http://schemas.microsoft.com/office/word/2012/wordml" xmlns:w16cex="http://schemas.microsoft.com/office/word/2018/wordml/cex" xmlns:w16cid="http://schemas.microsoft.com/office/word/2016/wordml/cid" xmlns:w16="http://schemas.microsoft.com/office/word/2018/wordml" xmlns:w16sdtdh="http://schemas.microsoft.com/office/word/2020/wordml/sdtdatahash" xmlns:w16se="http://schemas.microsoft.com/office/word/2015/wordml/symex" xmlns:wpg="http://schemas.microsoft.com/office/word/2010/wordprocessingGroup" xmlns:wpi="http://schemas.microsoft.com/office/word/2010/wordprocessingInk" xmlns:wne="http://schemas.microsoft.com/office/word/2006/wordml" xmlns:wps="http://schemas.microsoft.com/office/word/2010/wordprocessingShape" mc:Ignorable="w14 w15 w16se w16cid w16 w16cex w16sdtdh wp14">
   <w:abstractNum w:abstractNumId="0" w15:restartNumberingAfterBreak="0">
     <w:nsid w:val="00EF79BB"/>
     <w:multiLevelType w:val="multilevel"/>
@@ -5968,61 +5985,61 @@
       </w:rPr>
     </w:lvl>
   </w:abstractNum>
-  <w:num w:numId="1">
+  <w:num w:numId="1" w16cid:durableId="1574122452">
     <w:abstractNumId w:val="5"/>
   </w:num>
-  <w:num w:numId="2">
+  <w:num w:numId="2" w16cid:durableId="145511526">
     <w:abstractNumId w:val="7"/>
   </w:num>
-  <w:num w:numId="3">
+  <w:num w:numId="3" w16cid:durableId="972712716">
     <w:abstractNumId w:val="10"/>
   </w:num>
-  <w:num w:numId="4">
+  <w:num w:numId="4" w16cid:durableId="1546526117">
     <w:abstractNumId w:val="0"/>
   </w:num>
-  <w:num w:numId="5">
+  <w:num w:numId="5" w16cid:durableId="205945634">
     <w:abstractNumId w:val="9"/>
   </w:num>
-  <w:num w:numId="6">
+  <w:num w:numId="6" w16cid:durableId="291642800">
     <w:abstractNumId w:val="8"/>
   </w:num>
-  <w:num w:numId="7">
+  <w:num w:numId="7" w16cid:durableId="1161043321">
     <w:abstractNumId w:val="1"/>
   </w:num>
-  <w:num w:numId="8">
+  <w:num w:numId="8" w16cid:durableId="801120365">
     <w:abstractNumId w:val="2"/>
   </w:num>
-  <w:num w:numId="9">
+  <w:num w:numId="9" w16cid:durableId="1259291216">
     <w:abstractNumId w:val="6"/>
   </w:num>
-  <w:num w:numId="10">
+  <w:num w:numId="10" w16cid:durableId="952636001">
     <w:abstractNumId w:val="13"/>
   </w:num>
-  <w:num w:numId="11">
+  <w:num w:numId="11" w16cid:durableId="835731243">
     <w:abstractNumId w:val="15"/>
   </w:num>
-  <w:num w:numId="12">
+  <w:num w:numId="12" w16cid:durableId="1843619294">
     <w:abstractNumId w:val="16"/>
   </w:num>
-  <w:num w:numId="13">
+  <w:num w:numId="13" w16cid:durableId="1537083507">
     <w:abstractNumId w:val="18"/>
   </w:num>
-  <w:num w:numId="14">
+  <w:num w:numId="14" w16cid:durableId="1895196423">
     <w:abstractNumId w:val="14"/>
   </w:num>
-  <w:num w:numId="15">
+  <w:num w:numId="15" w16cid:durableId="1418290541">
     <w:abstractNumId w:val="17"/>
   </w:num>
-  <w:num w:numId="16">
+  <w:num w:numId="16" w16cid:durableId="1758017113">
     <w:abstractNumId w:val="3"/>
   </w:num>
-  <w:num w:numId="17">
+  <w:num w:numId="17" w16cid:durableId="1718122836">
     <w:abstractNumId w:val="12"/>
   </w:num>
-  <w:num w:numId="18">
+  <w:num w:numId="18" w16cid:durableId="159465574">
     <w:abstractNumId w:val="11"/>
   </w:num>
-  <w:num w:numId="19">
+  <w:num w:numId="19" w16cid:durableId="663317570">
     <w:abstractNumId w:val="4"/>
   </w:num>
 </w:numbering>
@@ -6036,7 +6053,7 @@
         <w:rFonts w:asciiTheme="minorHAnsi" w:eastAsiaTheme="minorHAnsi" w:hAnsiTheme="minorHAnsi" w:cstheme="minorBidi"/>
         <w:sz w:val="24"/>
         <w:szCs w:val="24"/>
-        <w:lang w:val="en-VN" w:eastAsia="en-US" w:bidi="ar-SA"/>
+        <w:lang w:eastAsia="en-US" w:bidi="ar-SA"/>
       </w:rPr>
     </w:rPrDefault>
     <w:pPrDefault/>

</xml_diff>